<commit_message>
Fix redlines and 2IP signature layout across all templates
All 6 templates: removed w:trackRevisions setting and accepted all
tracked changes (w:ins/w:del) so generated docs never open in
"markup visible" mode.

2ip_1agent: cleared redundant combined-name line (para 23) that was
showing IP1NAME AND IP2NAME above the individual signature blocks;
added page break before notary acknowledgment section.

prep_all_templates.py: added _accept_all_changes() called at prep
time; para 23 now set to "" for 2-IP combos; page break before notary
added for all 2-IP sources.
</commit_message>
<xml_diff>
--- a/poa_template_1ip_2agent.docx
+++ b/poa_template_1ip_2agent.docx
@@ -411,7 +411,6 @@
             <w:pPr>
               <w:pStyle w:val="SingleSpacing"/>
               <w:rPr>
-                <w:ins w:id="8" w:author="Jessie Li" w:date="2026-04-06T10:52:00Z" w16du:dateUtc="2026-04-06T17:52:00Z"/>
                 <w:sz w:val="24"/>
                 <w:szCs w:val="24"/>
               </w:rPr>
@@ -432,15 +431,13 @@
                 <w:szCs w:val="24"/>
               </w:rPr>
             </w:pPr>
-            <w:ins w:id="9" w:author="Jessie Li" w:date="2026-04-06T10:52:00Z" w16du:dateUtc="2026-04-06T17:52:00Z">
-              <w:r>
-                <w:rPr>
-                  <w:sz w:val="24"/>
-                  <w:szCs w:val="24"/>
-                </w:rPr>
-                <w:t>)</w:t>
-              </w:r>
-            </w:ins>
+            <w:r>
+              <w:rPr>
+                <w:sz w:val="24"/>
+                <w:szCs w:val="24"/>
+              </w:rPr>
+              <w:t>)</w:t>
+            </w:r>
           </w:p>
         </w:tc>
         <w:tc>
@@ -1520,7 +1517,6 @@
         <w:spacing w:line="240" w:lineRule="auto"/>
         <w:ind w:firstLine="720"/>
         <w:rPr>
-          <w:ins w:id="77" w:author="Jessie Li" w:date="2026-04-06T10:44:00Z" w16du:dateUtc="2026-04-06T17:44:00Z"/>
           <w:noProof/>
           <w:sz w:val="24"/>
           <w:szCs w:val="24"/>
@@ -1532,7 +1528,6 @@
         <w:spacing w:line="240" w:lineRule="auto"/>
         <w:ind w:firstLine="720"/>
         <w:rPr>
-          <w:ins w:id="78" w:author="Jessie Li" w:date="2026-04-06T10:44:00Z" w16du:dateUtc="2026-04-06T17:44:00Z"/>
           <w:noProof/>
           <w:sz w:val="24"/>
           <w:szCs w:val="24"/>
@@ -1544,7 +1539,6 @@
         <w:spacing w:line="240" w:lineRule="auto"/>
         <w:ind w:firstLine="720"/>
         <w:rPr>
-          <w:ins w:id="79" w:author="Jessie Li" w:date="2026-04-06T10:44:00Z" w16du:dateUtc="2026-04-06T17:44:00Z"/>
           <w:noProof/>
           <w:sz w:val="24"/>
           <w:szCs w:val="24"/>
@@ -1556,7 +1550,6 @@
         <w:spacing w:line="240" w:lineRule="auto"/>
         <w:ind w:firstLine="720"/>
         <w:rPr>
-          <w:ins w:id="80" w:author="Jessie Li" w:date="2026-04-06T10:44:00Z" w16du:dateUtc="2026-04-06T17:44:00Z"/>
           <w:noProof/>
           <w:sz w:val="24"/>
           <w:szCs w:val="24"/>
@@ -1568,7 +1561,6 @@
         <w:spacing w:line="240" w:lineRule="auto"/>
         <w:ind w:firstLine="720"/>
         <w:rPr>
-          <w:ins w:id="81" w:author="Jessie Li" w:date="2026-04-06T10:44:00Z" w16du:dateUtc="2026-04-06T17:44:00Z"/>
           <w:noProof/>
           <w:sz w:val="24"/>
           <w:szCs w:val="24"/>
@@ -1610,7 +1602,6 @@
         <w:spacing w:line="240" w:lineRule="auto"/>
         <w:ind w:firstLine="720"/>
         <w:rPr>
-          <w:del w:id="82" w:author="Jessie Li" w:date="2026-04-06T10:44:00Z" w16du:dateUtc="2026-04-06T17:44:00Z"/>
           <w:noProof/>
           <w:sz w:val="24"/>
           <w:szCs w:val="24"/>
@@ -1623,7 +1614,6 @@
         <w:spacing w:line="240" w:lineRule="auto"/>
         <w:ind w:firstLine="720"/>
         <w:rPr>
-          <w:del w:id="83" w:author="Jessie Li" w:date="2026-04-06T10:44:00Z" w16du:dateUtc="2026-04-06T17:44:00Z"/>
           <w:noProof/>
           <w:sz w:val="24"/>
           <w:szCs w:val="24"/>
@@ -1636,7 +1626,6 @@
         <w:spacing w:line="240" w:lineRule="auto"/>
         <w:ind w:firstLine="720"/>
         <w:rPr>
-          <w:del w:id="84" w:author="Jessie Li" w:date="2026-04-06T10:44:00Z" w16du:dateUtc="2026-04-06T17:44:00Z"/>
           <w:noProof/>
           <w:sz w:val="24"/>
           <w:szCs w:val="24"/>
@@ -1649,7 +1638,6 @@
         <w:spacing w:line="240" w:lineRule="auto"/>
         <w:ind w:firstLine="720"/>
         <w:rPr>
-          <w:del w:id="85" w:author="Jessie Li" w:date="2026-04-06T10:44:00Z" w16du:dateUtc="2026-04-06T17:44:00Z"/>
           <w:noProof/>
           <w:sz w:val="24"/>
           <w:szCs w:val="24"/>
@@ -1662,7 +1650,6 @@
         <w:spacing w:line="240" w:lineRule="auto"/>
         <w:ind w:firstLine="720"/>
         <w:rPr>
-          <w:del w:id="86" w:author="Jessie Li" w:date="2026-04-06T10:44:00Z" w16du:dateUtc="2026-04-06T17:44:00Z"/>
           <w:noProof/>
           <w:sz w:val="24"/>
           <w:szCs w:val="24"/>
@@ -1834,7 +1821,6 @@
         <w:spacing w:line="240" w:lineRule="auto"/>
         <w:ind w:firstLine="720"/>
         <w:rPr>
-          <w:ins w:id="87" w:author="Jessie Li" w:date="2026-04-06T10:43:00Z" w16du:dateUtc="2026-04-06T17:43:00Z"/>
           <w:noProof/>
           <w:sz w:val="24"/>
           <w:szCs w:val="24"/>
@@ -1846,7 +1832,6 @@
         <w:spacing w:line="240" w:lineRule="auto"/>
         <w:ind w:firstLine="720"/>
         <w:rPr>
-          <w:ins w:id="88" w:author="Jessie Li" w:date="2026-04-06T10:43:00Z" w16du:dateUtc="2026-04-06T17:43:00Z"/>
           <w:noProof/>
           <w:sz w:val="24"/>
           <w:szCs w:val="24"/>
@@ -1858,7 +1843,6 @@
         <w:spacing w:line="240" w:lineRule="auto"/>
         <w:ind w:firstLine="720"/>
         <w:rPr>
-          <w:ins w:id="89" w:author="Jessie Li" w:date="2026-04-06T10:43:00Z" w16du:dateUtc="2026-04-06T17:43:00Z"/>
           <w:noProof/>
           <w:sz w:val="24"/>
           <w:szCs w:val="24"/>
@@ -1870,7 +1854,6 @@
         <w:spacing w:line="240" w:lineRule="auto"/>
         <w:ind w:firstLine="720"/>
         <w:rPr>
-          <w:ins w:id="90" w:author="Jessie Li" w:date="2026-04-06T10:43:00Z" w16du:dateUtc="2026-04-06T17:43:00Z"/>
           <w:noProof/>
           <w:sz w:val="24"/>
           <w:szCs w:val="24"/>
@@ -1931,346 +1914,165 @@
       <w:pPr>
         <w:spacing w:line="240" w:lineRule="auto"/>
         <w:rPr>
-          <w:del w:id="91" w:author="Jessie Li" w:date="2026-04-06T10:44:00Z" w16du:dateUtc="2026-04-06T17:44:00Z"/>
-          <w:noProof/>
-          <w:sz w:val="24"/>
-          <w:szCs w:val="24"/>
-          <w:lang w:eastAsia="zh-CN"/>
-        </w:rPr>
-      </w:pPr>
-    </w:p>
-    <w:p>
-      <w:pPr>
-        <w:spacing w:line="240" w:lineRule="auto"/>
-        <w:rPr>
-          <w:del w:id="92" w:author="Jessie Li" w:date="2026-04-06T10:44:00Z" w16du:dateUtc="2026-04-06T17:44:00Z"/>
-          <w:noProof/>
-          <w:sz w:val="24"/>
-          <w:szCs w:val="24"/>
-          <w:lang w:eastAsia="zh-CN"/>
-        </w:rPr>
-      </w:pPr>
-    </w:p>
-    <w:p>
-      <w:pPr>
-        <w:spacing w:line="240" w:lineRule="auto"/>
-        <w:rPr>
-          <w:del w:id="93" w:author="Jessie Li" w:date="2026-04-06T10:44:00Z" w16du:dateUtc="2026-04-06T17:44:00Z"/>
-          <w:noProof/>
-          <w:sz w:val="24"/>
-          <w:szCs w:val="24"/>
-          <w:lang w:eastAsia="zh-CN"/>
-        </w:rPr>
-      </w:pPr>
-    </w:p>
-    <w:p>
-      <w:pPr>
-        <w:spacing w:line="240" w:lineRule="auto"/>
-        <w:rPr>
-          <w:del w:id="94" w:author="Jessie Li" w:date="2026-04-06T10:44:00Z" w16du:dateUtc="2026-04-06T17:44:00Z"/>
-          <w:noProof/>
-          <w:sz w:val="24"/>
-          <w:szCs w:val="24"/>
-          <w:lang w:eastAsia="zh-CN"/>
-        </w:rPr>
-      </w:pPr>
-    </w:p>
-    <w:p>
-      <w:pPr>
-        <w:spacing w:line="240" w:lineRule="auto"/>
-        <w:rPr>
-          <w:del w:id="95" w:author="Jessie Li" w:date="2026-04-06T10:43:00Z" w16du:dateUtc="2026-04-06T17:43:00Z"/>
-          <w:noProof/>
-          <w:sz w:val="24"/>
-          <w:szCs w:val="24"/>
-          <w:lang w:eastAsia="zh-CN"/>
-        </w:rPr>
-      </w:pPr>
-      <w:del w:id="96" w:author="Jessie Li" w:date="2026-04-06T10:42:00Z" w16du:dateUtc="2026-04-06T17:42:00Z">
-        <w:r>
-          <w:rPr>
-            <w:noProof/>
-            <w:sz w:val="24"/>
-            <w:szCs w:val="24"/>
-          </w:rPr>
-          <w:drawing>
-            <wp:anchor distT="0" distB="0" distL="114300" distR="114300" simplePos="0" relativeHeight="251661314" behindDoc="0" locked="0" layoutInCell="1" allowOverlap="1" wp14:anchorId="40EBF386" wp14:editId="217D761C">
-              <wp:simplePos x="0" y="0"/>
-              <wp:positionH relativeFrom="column">
-                <wp:posOffset>152400</wp:posOffset>
-              </wp:positionH>
-              <wp:positionV relativeFrom="paragraph">
-                <wp:posOffset>143510</wp:posOffset>
-              </wp:positionV>
-              <wp:extent cx="2247900" cy="3192145"/>
-              <wp:effectExtent l="0" t="0" r="0" b="8255"/>
-              <wp:wrapSquare wrapText="bothSides"/>
-              <wp:docPr id="1035321722" name="Picture 1"/>
-              <wp:cNvGraphicFramePr>
-                <a:graphicFrameLocks xmlns:a="http://schemas.openxmlformats.org/drawingml/2006/main" noChangeAspect="1"/>
-              </wp:cNvGraphicFramePr>
-              <a:graphic xmlns:a="http://schemas.openxmlformats.org/drawingml/2006/main">
-                <a:graphicData uri="http://schemas.openxmlformats.org/drawingml/2006/picture">
-                  <pic:pic xmlns:pic="http://schemas.openxmlformats.org/drawingml/2006/picture">
-                    <pic:nvPicPr>
-                      <pic:cNvPr id="1035321722" name=""/>
-                      <pic:cNvPicPr/>
-                    </pic:nvPicPr>
-                    <pic:blipFill>
-                      <a:blip r:embed="rId10">
-                        <a:extLst>
-                          <a:ext uri="{28A0092B-C50C-407E-A947-70E740481C1C}">
-                            <a14:useLocalDpi xmlns:a14="http://schemas.microsoft.com/office/drawing/2010/main" val="0"/>
-                          </a:ext>
-                        </a:extLst>
-                      </a:blip>
-                      <a:stretch>
-                        <a:fillRect/>
-                      </a:stretch>
-                    </pic:blipFill>
-                    <pic:spPr>
-                      <a:xfrm>
-                        <a:off x="0" y="0"/>
-                        <a:ext cx="2247900" cy="3192145"/>
-                      </a:xfrm>
-                      <a:prstGeom prst="rect">
-                        <a:avLst/>
-                      </a:prstGeom>
-                    </pic:spPr>
-                  </pic:pic>
-                </a:graphicData>
-              </a:graphic>
-              <wp14:sizeRelH relativeFrom="margin">
-                <wp14:pctWidth>0</wp14:pctWidth>
-              </wp14:sizeRelH>
-              <wp14:sizeRelV relativeFrom="margin">
-                <wp14:pctHeight>0</wp14:pctHeight>
-              </wp14:sizeRelV>
-            </wp:anchor>
-          </w:drawing>
-        </w:r>
-      </w:del>
-    </w:p>
-    <w:p>
-      <w:pPr>
-        <w:spacing w:line="240" w:lineRule="auto"/>
-        <w:rPr>
-          <w:del w:id="97" w:author="Jessie Li" w:date="2026-04-06T10:43:00Z" w16du:dateUtc="2026-04-06T17:43:00Z"/>
-          <w:noProof/>
-          <w:sz w:val="24"/>
-          <w:szCs w:val="24"/>
-          <w:lang w:eastAsia="zh-CN"/>
-        </w:rPr>
-      </w:pPr>
-    </w:p>
-    <w:p>
-      <w:pPr>
-        <w:spacing w:line="240" w:lineRule="auto"/>
-        <w:rPr>
-          <w:del w:id="98" w:author="Jessie Li" w:date="2026-04-06T10:43:00Z" w16du:dateUtc="2026-04-06T17:43:00Z"/>
-          <w:noProof/>
-          <w:sz w:val="24"/>
-          <w:szCs w:val="24"/>
-          <w:lang w:eastAsia="zh-CN"/>
-        </w:rPr>
-      </w:pPr>
-    </w:p>
-    <w:p>
-      <w:pPr>
-        <w:spacing w:line="240" w:lineRule="auto"/>
-        <w:rPr>
-          <w:del w:id="99" w:author="Jessie Li" w:date="2026-04-06T10:43:00Z" w16du:dateUtc="2026-04-06T17:43:00Z"/>
-          <w:noProof/>
-          <w:sz w:val="24"/>
-          <w:szCs w:val="24"/>
-          <w:lang w:eastAsia="zh-CN"/>
-        </w:rPr>
-      </w:pPr>
-    </w:p>
-    <w:p>
-      <w:pPr>
-        <w:spacing w:line="240" w:lineRule="auto"/>
-        <w:rPr>
-          <w:del w:id="100" w:author="Jessie Li" w:date="2026-04-06T10:42:00Z" w16du:dateUtc="2026-04-06T17:42:00Z"/>
-          <w:noProof/>
-          <w:sz w:val="24"/>
-          <w:szCs w:val="24"/>
-          <w:lang w:eastAsia="zh-CN"/>
-        </w:rPr>
-      </w:pPr>
-    </w:p>
-    <w:p>
-      <w:pPr>
-        <w:spacing w:line="240" w:lineRule="auto"/>
-        <w:rPr>
-          <w:del w:id="101" w:author="Jessie Li" w:date="2026-04-06T10:42:00Z" w16du:dateUtc="2026-04-06T17:42:00Z"/>
-          <w:noProof/>
-          <w:sz w:val="24"/>
-          <w:szCs w:val="24"/>
-          <w:lang w:eastAsia="zh-CN"/>
-        </w:rPr>
-      </w:pPr>
-    </w:p>
-    <w:p>
-      <w:pPr>
-        <w:spacing w:line="240" w:lineRule="auto"/>
-        <w:rPr>
-          <w:del w:id="102" w:author="Jessie Li" w:date="2026-04-06T10:42:00Z" w16du:dateUtc="2026-04-06T17:42:00Z"/>
-          <w:noProof/>
-          <w:sz w:val="24"/>
-          <w:szCs w:val="24"/>
-          <w:lang w:eastAsia="zh-CN"/>
-        </w:rPr>
-      </w:pPr>
-    </w:p>
-    <w:p>
-      <w:pPr>
-        <w:spacing w:line="240" w:lineRule="auto"/>
-        <w:rPr>
-          <w:del w:id="103" w:author="Jessie Li" w:date="2026-04-06T10:42:00Z" w16du:dateUtc="2026-04-06T17:42:00Z"/>
-          <w:noProof/>
-          <w:sz w:val="24"/>
-          <w:szCs w:val="24"/>
-          <w:lang w:eastAsia="zh-CN"/>
-        </w:rPr>
-      </w:pPr>
-    </w:p>
-    <w:p>
-      <w:pPr>
-        <w:spacing w:line="240" w:lineRule="auto"/>
-        <w:rPr>
-          <w:del w:id="104" w:author="Jessie Li" w:date="2026-04-06T10:42:00Z" w16du:dateUtc="2026-04-06T17:42:00Z"/>
-          <w:noProof/>
-          <w:sz w:val="24"/>
-          <w:szCs w:val="24"/>
-          <w:lang w:eastAsia="zh-CN"/>
-        </w:rPr>
-      </w:pPr>
-    </w:p>
-    <w:p>
-      <w:pPr>
-        <w:spacing w:line="240" w:lineRule="auto"/>
-        <w:rPr>
-          <w:del w:id="105" w:author="Jessie Li" w:date="2026-04-06T10:42:00Z" w16du:dateUtc="2026-04-06T17:42:00Z"/>
-          <w:noProof/>
-          <w:sz w:val="24"/>
-          <w:szCs w:val="24"/>
-          <w:lang w:eastAsia="zh-CN"/>
-        </w:rPr>
-      </w:pPr>
-      <w:del w:id="106" w:author="Jessie Li" w:date="2026-04-06T10:42:00Z" w16du:dateUtc="2026-04-06T17:42:00Z">
-        <w:r>
-          <w:rPr>
-            <w:rFonts w:hint="eastAsia"/>
-            <w:noProof/>
-            <w:sz w:val="24"/>
-            <w:szCs w:val="24"/>
-            <w:lang w:eastAsia="zh-CN"/>
-          </w:rPr>
-          <w:delText xml:space="preserve">  </w:delText>
-        </w:r>
-        <w:r>
-          <w:rPr>
-            <w:noProof/>
-            <w:sz w:val="24"/>
-            <w:szCs w:val="24"/>
-            <w:lang w:eastAsia="zh-CN"/>
-          </w:rPr>
-          <w:tab/>
-        </w:r>
-        <w:r>
-          <w:rPr>
-            <w:noProof/>
-            <w:sz w:val="24"/>
-            <w:szCs w:val="24"/>
-            <w:lang w:eastAsia="zh-CN"/>
-          </w:rPr>
-          <w:tab/>
-        </w:r>
-        <w:r>
-          <w:rPr>
-            <w:noProof/>
-            <w:sz w:val="24"/>
-            <w:szCs w:val="24"/>
-            <w:lang w:eastAsia="zh-CN"/>
-          </w:rPr>
-          <w:tab/>
-        </w:r>
-        <w:r>
-          <w:rPr>
-            <w:rFonts w:hint="eastAsia"/>
-            <w:noProof/>
-            <w:sz w:val="24"/>
-            <w:szCs w:val="24"/>
-            <w:lang w:eastAsia="zh-CN"/>
-          </w:rPr>
-          <w:delText xml:space="preserve">       </w:delText>
-        </w:r>
-        <w:r>
-          <w:rPr>
-            <w:rFonts w:hint="eastAsia"/>
-            <w:noProof/>
-            <w:sz w:val="24"/>
-            <w:szCs w:val="24"/>
-            <w:lang w:eastAsia="zh-CN"/>
-          </w:rPr>
-          <w:delText xml:space="preserve">  </w:delText>
-        </w:r>
-        <w:r>
-          <w:rPr>
-            <w:rFonts w:hint="eastAsia"/>
-            <w:noProof/>
-            <w:sz w:val="24"/>
-            <w:szCs w:val="24"/>
-            <w:lang w:eastAsia="zh-CN"/>
-          </w:rPr>
-          <w:delText>P</w:delText>
-        </w:r>
-        <w:r>
-          <w:rPr>
-            <w:noProof/>
-            <w:sz w:val="24"/>
-            <w:szCs w:val="24"/>
-          </w:rPr>
-          <w:delText>ower of Attorney</w:delText>
-        </w:r>
-        <w:r>
-          <w:rPr>
-            <w:rFonts w:hint="eastAsia"/>
-            <w:noProof/>
-            <w:sz w:val="24"/>
-            <w:szCs w:val="24"/>
-            <w:lang w:eastAsia="zh-CN"/>
-          </w:rPr>
-          <w:delText xml:space="preserve"> </w:delText>
-        </w:r>
-        <w:r>
-          <w:rPr>
-            <w:noProof/>
-            <w:sz w:val="24"/>
-            <w:szCs w:val="24"/>
-            <w:lang w:eastAsia="zh-CN"/>
-          </w:rPr>
-          <w:delText>3</w:delText>
-        </w:r>
-      </w:del>
-    </w:p>
-    <w:p>
-      <w:pPr>
-        <w:spacing w:line="240" w:lineRule="auto"/>
-        <w:rPr>
-          <w:del w:id="107" w:author="Jessie Li" w:date="2026-04-06T10:43:00Z" w16du:dateUtc="2026-04-06T17:43:00Z"/>
-          <w:noProof/>
-          <w:sz w:val="24"/>
-          <w:szCs w:val="24"/>
-          <w:lang w:eastAsia="zh-CN"/>
-        </w:rPr>
-        <w:pPrChange w:id="108" w:author="Jessie Li" w:date="2026-04-06T10:42:00Z" w16du:dateUtc="2026-04-06T17:42:00Z">
-          <w:pPr>
-            <w:spacing w:line="240" w:lineRule="auto"/>
-            <w:ind w:firstLine="720"/>
-          </w:pPr>
-        </w:pPrChange>
+          <w:noProof/>
+          <w:sz w:val="24"/>
+          <w:szCs w:val="24"/>
+          <w:lang w:eastAsia="zh-CN"/>
+        </w:rPr>
+      </w:pPr>
+    </w:p>
+    <w:p>
+      <w:pPr>
+        <w:spacing w:line="240" w:lineRule="auto"/>
+        <w:rPr>
+          <w:noProof/>
+          <w:sz w:val="24"/>
+          <w:szCs w:val="24"/>
+          <w:lang w:eastAsia="zh-CN"/>
+        </w:rPr>
+      </w:pPr>
+    </w:p>
+    <w:p>
+      <w:pPr>
+        <w:spacing w:line="240" w:lineRule="auto"/>
+        <w:rPr>
+          <w:noProof/>
+          <w:sz w:val="24"/>
+          <w:szCs w:val="24"/>
+          <w:lang w:eastAsia="zh-CN"/>
+        </w:rPr>
+      </w:pPr>
+    </w:p>
+    <w:p>
+      <w:pPr>
+        <w:spacing w:line="240" w:lineRule="auto"/>
+        <w:rPr>
+          <w:noProof/>
+          <w:sz w:val="24"/>
+          <w:szCs w:val="24"/>
+          <w:lang w:eastAsia="zh-CN"/>
+        </w:rPr>
+      </w:pPr>
+    </w:p>
+    <w:p>
+      <w:pPr>
+        <w:spacing w:line="240" w:lineRule="auto"/>
+        <w:rPr>
+          <w:noProof/>
+          <w:sz w:val="24"/>
+          <w:szCs w:val="24"/>
+          <w:lang w:eastAsia="zh-CN"/>
+        </w:rPr>
+      </w:pPr>
+    </w:p>
+    <w:p>
+      <w:pPr>
+        <w:spacing w:line="240" w:lineRule="auto"/>
+        <w:rPr>
+          <w:noProof/>
+          <w:sz w:val="24"/>
+          <w:szCs w:val="24"/>
+          <w:lang w:eastAsia="zh-CN"/>
+        </w:rPr>
+      </w:pPr>
+    </w:p>
+    <w:p>
+      <w:pPr>
+        <w:spacing w:line="240" w:lineRule="auto"/>
+        <w:rPr>
+          <w:noProof/>
+          <w:sz w:val="24"/>
+          <w:szCs w:val="24"/>
+          <w:lang w:eastAsia="zh-CN"/>
+        </w:rPr>
+      </w:pPr>
+    </w:p>
+    <w:p>
+      <w:pPr>
+        <w:spacing w:line="240" w:lineRule="auto"/>
+        <w:rPr>
+          <w:noProof/>
+          <w:sz w:val="24"/>
+          <w:szCs w:val="24"/>
+          <w:lang w:eastAsia="zh-CN"/>
+        </w:rPr>
+      </w:pPr>
+    </w:p>
+    <w:p>
+      <w:pPr>
+        <w:spacing w:line="240" w:lineRule="auto"/>
+        <w:rPr>
+          <w:noProof/>
+          <w:sz w:val="24"/>
+          <w:szCs w:val="24"/>
+          <w:lang w:eastAsia="zh-CN"/>
+        </w:rPr>
+      </w:pPr>
+    </w:p>
+    <w:p>
+      <w:pPr>
+        <w:spacing w:line="240" w:lineRule="auto"/>
+        <w:rPr>
+          <w:noProof/>
+          <w:sz w:val="24"/>
+          <w:szCs w:val="24"/>
+          <w:lang w:eastAsia="zh-CN"/>
+        </w:rPr>
+      </w:pPr>
+    </w:p>
+    <w:p>
+      <w:pPr>
+        <w:spacing w:line="240" w:lineRule="auto"/>
+        <w:rPr>
+          <w:noProof/>
+          <w:sz w:val="24"/>
+          <w:szCs w:val="24"/>
+          <w:lang w:eastAsia="zh-CN"/>
+        </w:rPr>
+      </w:pPr>
+    </w:p>
+    <w:p>
+      <w:pPr>
+        <w:spacing w:line="240" w:lineRule="auto"/>
+        <w:rPr>
+          <w:noProof/>
+          <w:sz w:val="24"/>
+          <w:szCs w:val="24"/>
+          <w:lang w:eastAsia="zh-CN"/>
+        </w:rPr>
+      </w:pPr>
+    </w:p>
+    <w:p>
+      <w:pPr>
+        <w:spacing w:line="240" w:lineRule="auto"/>
+        <w:rPr>
+          <w:noProof/>
+          <w:sz w:val="24"/>
+          <w:szCs w:val="24"/>
+          <w:lang w:eastAsia="zh-CN"/>
+        </w:rPr>
+      </w:pPr>
+    </w:p>
+    <w:p>
+      <w:pPr>
+        <w:spacing w:line="240" w:lineRule="auto"/>
+        <w:rPr>
+          <w:noProof/>
+          <w:sz w:val="24"/>
+          <w:szCs w:val="24"/>
+          <w:lang w:eastAsia="zh-CN"/>
+        </w:rPr>
+      </w:pPr>
+    </w:p>
+    <w:p>
+      <w:pPr>
+        <w:spacing w:line="240" w:lineRule="auto"/>
+        <w:rPr>
+          <w:noProof/>
+          <w:sz w:val="24"/>
+          <w:szCs w:val="24"/>
+          <w:lang w:eastAsia="zh-CN"/>
+        </w:rPr>
       </w:pPr>
     </w:p>
     <w:p>
@@ -2278,7 +2080,6 @@
         <w:spacing w:line="240" w:lineRule="auto"/>
         <w:ind w:firstLine="720"/>
         <w:rPr>
-          <w:del w:id="109" w:author="Jessie Li" w:date="2026-04-06T10:43:00Z" w16du:dateUtc="2026-04-06T17:43:00Z"/>
           <w:noProof/>
           <w:sz w:val="24"/>
           <w:szCs w:val="24"/>
@@ -2291,7 +2092,6 @@
         <w:spacing w:line="240" w:lineRule="auto"/>
         <w:ind w:firstLine="720"/>
         <w:rPr>
-          <w:del w:id="110" w:author="Jessie Li" w:date="2026-04-06T10:43:00Z" w16du:dateUtc="2026-04-06T17:43:00Z"/>
           <w:noProof/>
           <w:sz w:val="24"/>
           <w:szCs w:val="24"/>
@@ -2304,36 +2104,28 @@
         <w:spacing w:line="240" w:lineRule="auto"/>
         <w:ind w:firstLine="720"/>
         <w:rPr>
-          <w:del w:id="111" w:author="Jessie Li" w:date="2026-04-06T10:43:00Z" w16du:dateUtc="2026-04-06T17:43:00Z"/>
-          <w:noProof/>
-          <w:sz w:val="24"/>
-          <w:szCs w:val="24"/>
-          <w:lang w:eastAsia="zh-CN"/>
-        </w:rPr>
-      </w:pPr>
-    </w:p>
-    <w:p>
-      <w:pPr>
-        <w:spacing w:line="240" w:lineRule="auto"/>
-        <w:rPr>
-          <w:noProof/>
-          <w:sz w:val="24"/>
-          <w:szCs w:val="24"/>
-          <w:lang w:eastAsia="zh-CN"/>
-        </w:rPr>
-        <w:pPrChange w:id="112" w:author="Jessie Li" w:date="2026-04-06T10:43:00Z" w16du:dateUtc="2026-04-06T17:43:00Z">
-          <w:pPr>
-            <w:spacing w:line="240" w:lineRule="auto"/>
-            <w:ind w:firstLine="720"/>
-          </w:pPr>
-        </w:pPrChange>
-      </w:pPr>
-    </w:p>
-    <w:p>
-      <w:pPr>
-        <w:spacing w:line="240" w:lineRule="auto"/>
-        <w:rPr>
-          <w:del w:id="113" w:author="Jessie Li" w:date="2026-04-06T10:43:00Z" w16du:dateUtc="2026-04-06T17:43:00Z"/>
+          <w:noProof/>
+          <w:sz w:val="24"/>
+          <w:szCs w:val="24"/>
+          <w:lang w:eastAsia="zh-CN"/>
+        </w:rPr>
+      </w:pPr>
+    </w:p>
+    <w:p>
+      <w:pPr>
+        <w:spacing w:line="240" w:lineRule="auto"/>
+        <w:rPr>
+          <w:noProof/>
+          <w:sz w:val="24"/>
+          <w:szCs w:val="24"/>
+          <w:lang w:eastAsia="zh-CN"/>
+        </w:rPr>
+      </w:pPr>
+    </w:p>
+    <w:p>
+      <w:pPr>
+        <w:spacing w:line="240" w:lineRule="auto"/>
+        <w:rPr>
           <w:noProof/>
           <w:sz w:val="24"/>
           <w:szCs w:val="24"/>
@@ -2348,165 +2140,89 @@
         </w:rPr>
         <w:br w:type="textWrapping" w:clear="all"/>
       </w:r>
-      <w:del w:id="114" w:author="Jessie Li" w:date="2026-04-06T10:43:00Z" w16du:dateUtc="2026-04-06T17:43:00Z">
-        <w:r>
-          <w:rPr>
-            <w:noProof/>
-            <w:sz w:val="24"/>
-            <w:szCs w:val="24"/>
-          </w:rPr>
-          <w:drawing>
-            <wp:inline distT="0" distB="0" distL="0" distR="0" wp14:anchorId="536ECE63" wp14:editId="3E3A0B6D">
-              <wp:extent cx="3146652" cy="3810000"/>
-              <wp:effectExtent l="0" t="0" r="0" b="0"/>
-              <wp:docPr id="1762645745" name="Picture 1"/>
-              <wp:cNvGraphicFramePr>
-                <a:graphicFrameLocks xmlns:a="http://schemas.openxmlformats.org/drawingml/2006/main" noChangeAspect="1"/>
-              </wp:cNvGraphicFramePr>
-              <a:graphic xmlns:a="http://schemas.openxmlformats.org/drawingml/2006/main">
-                <a:graphicData uri="http://schemas.openxmlformats.org/drawingml/2006/picture">
-                  <pic:pic xmlns:pic="http://schemas.openxmlformats.org/drawingml/2006/picture">
-                    <pic:nvPicPr>
-                      <pic:cNvPr id="1762645745" name=""/>
-                      <pic:cNvPicPr/>
-                    </pic:nvPicPr>
-                    <pic:blipFill>
-                      <a:blip r:embed="rId11"/>
-                      <a:stretch>
-                        <a:fillRect/>
-                      </a:stretch>
-                    </pic:blipFill>
-                    <pic:spPr>
-                      <a:xfrm>
-                        <a:off x="0" y="0"/>
-                        <a:ext cx="3155999" cy="3821317"/>
-                      </a:xfrm>
-                      <a:prstGeom prst="rect">
-                        <a:avLst/>
-                      </a:prstGeom>
-                    </pic:spPr>
-                  </pic:pic>
-                </a:graphicData>
-              </a:graphic>
-            </wp:inline>
-          </w:drawing>
-        </w:r>
-      </w:del>
-      <w:ins w:id="115" w:author="Jessie Li" w:date="2026-04-06T10:43:00Z" w16du:dateUtc="2026-04-06T17:43:00Z">
-        <w:r>
-          <w:rPr>
-            <w:noProof/>
-          </w:rPr>
-          <w:t xml:space="preserve"> </w:t>
-        </w:r>
-        <w:r>
-          <w:rPr>
-            <w:noProof/>
-            <w:sz w:val="24"/>
-            <w:szCs w:val="24"/>
-          </w:rPr>
-          <w:drawing>
-            <wp:inline distT="0" distB="0" distL="0" distR="0" wp14:anchorId="3709E080" wp14:editId="10F65DA1">
-              <wp:extent cx="3677309" cy="2543175"/>
-              <wp:effectExtent l="0" t="0" r="0" b="0"/>
-              <wp:docPr id="683480666" name="Picture 1"/>
-              <wp:cNvGraphicFramePr>
-                <a:graphicFrameLocks xmlns:a="http://schemas.openxmlformats.org/drawingml/2006/main" noChangeAspect="1"/>
-              </wp:cNvGraphicFramePr>
-              <a:graphic xmlns:a="http://schemas.openxmlformats.org/drawingml/2006/main">
-                <a:graphicData uri="http://schemas.openxmlformats.org/drawingml/2006/picture">
-                  <pic:pic xmlns:pic="http://schemas.openxmlformats.org/drawingml/2006/picture">
-                    <pic:nvPicPr>
-                      <pic:cNvPr id="683480666" name=""/>
-                      <pic:cNvPicPr/>
-                    </pic:nvPicPr>
-                    <pic:blipFill>
-                      <a:blip r:embed="rId12"/>
-                      <a:stretch>
-                        <a:fillRect/>
-                      </a:stretch>
-                    </pic:blipFill>
-                    <pic:spPr>
-                      <a:xfrm>
-                        <a:off x="0" y="0"/>
-                        <a:ext cx="3683706" cy="2547599"/>
-                      </a:xfrm>
-                      <a:prstGeom prst="rect">
-                        <a:avLst/>
-                      </a:prstGeom>
-                    </pic:spPr>
-                  </pic:pic>
-                </a:graphicData>
-              </a:graphic>
-            </wp:inline>
-          </w:drawing>
-        </w:r>
-        <w:r>
-          <w:rPr>
-            <w:rFonts w:hint="eastAsia"/>
-            <w:noProof/>
-            <w:lang w:eastAsia="zh-CN"/>
-          </w:rPr>
-          <w:t xml:space="preserve">       </w:t>
-        </w:r>
-      </w:ins>
-      <w:ins w:id="116" w:author="Jessie Li" w:date="2026-04-06T10:44:00Z" w16du:dateUtc="2026-04-06T17:44:00Z">
-        <w:r>
-          <w:rPr>
-            <w:noProof/>
-            <w:sz w:val="24"/>
-            <w:szCs w:val="24"/>
-            <w:lang w:eastAsia="zh-CN"/>
-            <w:rPrChange w:id="117" w:author="Jessie Li" w:date="2026-04-06T10:44:00Z" w16du:dateUtc="2026-04-06T17:44:00Z">
-              <w:rPr>
-                <w:noProof/>
-                <w:lang w:eastAsia="zh-CN"/>
-              </w:rPr>
-            </w:rPrChange>
-          </w:rPr>
-          <w:t>Intended Father</w:t>
-        </w:r>
-      </w:ins>
-      <w:ins w:id="118" w:author="Jessie Li" w:date="2026-04-06T10:43:00Z" w16du:dateUtc="2026-04-06T17:43:00Z">
-        <w:r>
-          <w:rPr>
-            <w:noProof/>
-            <w:sz w:val="24"/>
-            <w:szCs w:val="24"/>
-            <w:lang w:eastAsia="zh-CN"/>
-            <w:rPrChange w:id="119" w:author="Jessie Li" w:date="2026-04-06T10:44:00Z" w16du:dateUtc="2026-04-06T17:44:00Z">
-              <w:rPr>
-                <w:noProof/>
-                <w:lang w:eastAsia="zh-CN"/>
-              </w:rPr>
-            </w:rPrChange>
-          </w:rPr>
-          <w:t xml:space="preserve">  </w:t>
-        </w:r>
-      </w:ins>
-    </w:p>
-    <w:p>
-      <w:pPr>
-        <w:spacing w:line="240" w:lineRule="auto"/>
-        <w:rPr>
-          <w:sz w:val="24"/>
-          <w:szCs w:val="24"/>
-          <w:rPrChange w:id="120" w:author="Jessie Li" w:date="2026-04-06T10:44:00Z" w16du:dateUtc="2026-04-06T17:44:00Z">
-            <w:rPr>
-              <w:szCs w:val="24"/>
-            </w:rPr>
-          </w:rPrChange>
-        </w:rPr>
-      </w:pPr>
-      <w:del w:id="121" w:author="Jessie Li" w:date="2026-04-06T10:43:00Z" w16du:dateUtc="2026-04-06T17:43:00Z">
-        <w:r>
-          <w:rPr>
-            <w:sz w:val="24"/>
-            <w:szCs w:val="24"/>
-          </w:rPr>
-          <w:delText>Intended Father</w:delText>
-        </w:r>
-      </w:del>
+      <w:r>
+        <w:rPr>
+          <w:noProof/>
+        </w:rPr>
+        <w:t xml:space="preserve"> </w:t>
+      </w:r>
+      <w:r>
+        <w:rPr>
+          <w:noProof/>
+          <w:sz w:val="24"/>
+          <w:szCs w:val="24"/>
+        </w:rPr>
+        <w:drawing>
+          <wp:inline distT="0" distB="0" distL="0" distR="0" wp14:anchorId="3709E080" wp14:editId="10F65DA1">
+            <wp:extent cx="3677309" cy="2543175"/>
+            <wp:effectExtent l="0" t="0" r="0" b="0"/>
+            <wp:docPr id="683480666" name="Picture 1"/>
+            <wp:cNvGraphicFramePr>
+              <a:graphicFrameLocks xmlns:a="http://schemas.openxmlformats.org/drawingml/2006/main" noChangeAspect="1"/>
+            </wp:cNvGraphicFramePr>
+            <a:graphic xmlns:a="http://schemas.openxmlformats.org/drawingml/2006/main">
+              <a:graphicData uri="http://schemas.openxmlformats.org/drawingml/2006/picture">
+                <pic:pic xmlns:pic="http://schemas.openxmlformats.org/drawingml/2006/picture">
+                  <pic:nvPicPr>
+                    <pic:cNvPr id="683480666" name=""/>
+                    <pic:cNvPicPr/>
+                  </pic:nvPicPr>
+                  <pic:blipFill>
+                    <a:blip r:embed="rId12"/>
+                    <a:stretch>
+                      <a:fillRect/>
+                    </a:stretch>
+                  </pic:blipFill>
+                  <pic:spPr>
+                    <a:xfrm>
+                      <a:off x="0" y="0"/>
+                      <a:ext cx="3683706" cy="2547599"/>
+                    </a:xfrm>
+                    <a:prstGeom prst="rect">
+                      <a:avLst/>
+                    </a:prstGeom>
+                  </pic:spPr>
+                </pic:pic>
+              </a:graphicData>
+            </a:graphic>
+          </wp:inline>
+        </w:drawing>
+      </w:r>
+      <w:r>
+        <w:rPr>
+          <w:rFonts w:hint="eastAsia"/>
+          <w:noProof/>
+          <w:lang w:eastAsia="zh-CN"/>
+        </w:rPr>
+        <w:t xml:space="preserve">       </w:t>
+      </w:r>
+      <w:r>
+        <w:rPr>
+          <w:noProof/>
+          <w:sz w:val="24"/>
+          <w:szCs w:val="24"/>
+          <w:lang w:eastAsia="zh-CN"/>
+        </w:rPr>
+        <w:t>Intended Father</w:t>
+      </w:r>
+      <w:r>
+        <w:rPr>
+          <w:noProof/>
+          <w:sz w:val="24"/>
+          <w:szCs w:val="24"/>
+          <w:lang w:eastAsia="zh-CN"/>
+        </w:rPr>
+        <w:t xml:space="preserve">  </w:t>
+      </w:r>
+    </w:p>
+    <w:p>
+      <w:pPr>
+        <w:spacing w:line="240" w:lineRule="auto"/>
+        <w:rPr>
+          <w:sz w:val="24"/>
+          <w:szCs w:val="24"/>
+        </w:rPr>
+      </w:pPr>
     </w:p>
     <w:sectPr>
       <w:headerReference w:type="default" r:id="rId13"/>

</xml_diff>